<commit_message>
docs: update resume with latest version
</commit_message>
<xml_diff>
--- a/resume.docx
+++ b/resume.docx
@@ -18,7 +18,25 @@
           <w:sz w:val="32"/>
           <w:szCs w:val="32"/>
         </w:rPr>
-        <w:t>鸿雁战队（逐雁创新实验室）视觉组</w:t>
+        <w:t>鸿雁战队（</w:t>
+      </w:r>
+      <w:proofErr w:type="gramStart"/>
+      <w:r>
+        <w:rPr>
+          <w:rFonts w:ascii="微软雅黑" w:eastAsia="微软雅黑" w:hAnsi="微软雅黑" w:hint="eastAsia"/>
+          <w:sz w:val="32"/>
+          <w:szCs w:val="32"/>
+        </w:rPr>
+        <w:t>逐雁创新</w:t>
+      </w:r>
+      <w:proofErr w:type="gramEnd"/>
+      <w:r>
+        <w:rPr>
+          <w:rFonts w:ascii="微软雅黑" w:eastAsia="微软雅黑" w:hAnsi="微软雅黑" w:hint="eastAsia"/>
+          <w:sz w:val="32"/>
+          <w:szCs w:val="32"/>
+        </w:rPr>
+        <w:t>实验室）视觉组</w:t>
       </w:r>
       <w:r>
         <w:rPr>
@@ -45,11 +63,11 @@
         <w:tblLook w:val="04A0" w:firstRow="1" w:lastRow="0" w:firstColumn="1" w:lastColumn="0" w:noHBand="0" w:noVBand="1"/>
       </w:tblPr>
       <w:tblGrid>
-        <w:gridCol w:w="1061"/>
-        <w:gridCol w:w="918"/>
-        <w:gridCol w:w="1903"/>
-        <w:gridCol w:w="1741"/>
-        <w:gridCol w:w="1192"/>
+        <w:gridCol w:w="1693"/>
+        <w:gridCol w:w="1338"/>
+        <w:gridCol w:w="1449"/>
+        <w:gridCol w:w="1359"/>
+        <w:gridCol w:w="976"/>
         <w:gridCol w:w="2232"/>
       </w:tblGrid>
       <w:tr>
@@ -150,8 +168,17 @@
                 <w:rFonts w:asciiTheme="majorEastAsia" w:eastAsiaTheme="majorEastAsia" w:hAnsiTheme="majorEastAsia" w:hint="eastAsia"/>
                 <w:szCs w:val="21"/>
               </w:rPr>
-              <w:t>大一</w:t>
-            </w:r>
+              <w:t>大</w:t>
+            </w:r>
+            <w:proofErr w:type="gramStart"/>
+            <w:r>
+              <w:rPr>
+                <w:rFonts w:asciiTheme="majorEastAsia" w:eastAsiaTheme="majorEastAsia" w:hAnsiTheme="majorEastAsia" w:hint="eastAsia"/>
+                <w:szCs w:val="21"/>
+              </w:rPr>
+              <w:t>一</w:t>
+            </w:r>
+            <w:proofErr w:type="gramEnd"/>
           </w:p>
         </w:tc>
         <w:tc>
@@ -168,9 +195,6 @@
             <w:pPr>
               <w:spacing w:line="360" w:lineRule="auto"/>
               <w:jc w:val="center"/>
-              <w:rPr>
-                <w:rFonts w:hint="eastAsia"/>
-              </w:rPr>
             </w:pPr>
             <w:r>
               <w:rPr>
@@ -350,7 +374,21 @@
               <w:rPr>
                 <w:rFonts w:ascii="黑体" w:eastAsia="黑体" w:hAnsi="黑体"/>
               </w:rPr>
-              <w:t>GitHub / Gitee / Gitlab 个人主页</w:t>
+              <w:t xml:space="preserve">GitHub / </w:t>
+            </w:r>
+            <w:proofErr w:type="spellStart"/>
+            <w:r>
+              <w:rPr>
+                <w:rFonts w:ascii="黑体" w:eastAsia="黑体" w:hAnsi="黑体"/>
+              </w:rPr>
+              <w:t>Gitee</w:t>
+            </w:r>
+            <w:proofErr w:type="spellEnd"/>
+            <w:r>
+              <w:rPr>
+                <w:rFonts w:ascii="黑体" w:eastAsia="黑体" w:hAnsi="黑体"/>
+              </w:rPr>
+              <w:t xml:space="preserve"> / Gitlab 个人主页</w:t>
             </w:r>
           </w:p>
         </w:tc>
@@ -374,7 +412,7 @@
                 <w:rFonts w:asciiTheme="majorEastAsia" w:eastAsiaTheme="majorEastAsia" w:hAnsiTheme="majorEastAsia"/>
                 <w:szCs w:val="21"/>
               </w:rPr>
-              <w:t>https://github.com/Hugolcw/your_project_name</w:t>
+              <w:t>https://github.com/Hugolcw</w:t>
             </w:r>
           </w:p>
         </w:tc>
@@ -713,8 +751,17 @@
                 <w:rFonts w:ascii="黑体" w:eastAsia="黑体" w:hAnsi="黑体" w:hint="eastAsia"/>
                 <w:color w:val="808080" w:themeColor="background1" w:themeShade="80"/>
               </w:rPr>
-              <w:t xml:space="preserve">   无，高中忙着刷题捏</w:t>
-            </w:r>
+              <w:t xml:space="preserve">   无，高中忙着</w:t>
+            </w:r>
+            <w:proofErr w:type="gramStart"/>
+            <w:r>
+              <w:rPr>
+                <w:rFonts w:ascii="黑体" w:eastAsia="黑体" w:hAnsi="黑体" w:hint="eastAsia"/>
+                <w:color w:val="808080" w:themeColor="background1" w:themeShade="80"/>
+              </w:rPr>
+              <w:t>刷题捏</w:t>
+            </w:r>
+            <w:proofErr w:type="gramEnd"/>
           </w:p>
         </w:tc>
         <w:tc>
@@ -940,12 +987,21 @@
               </w:rPr>
               <w:t>级</w:t>
             </w:r>
-            <w:r>
-              <w:rPr>
-                <w:rFonts w:ascii="黑体" w:eastAsia="黑体" w:hAnsi="黑体" w:hint="eastAsia"/>
-                <w:color w:val="808080" w:themeColor="background1" w:themeShade="80"/>
-              </w:rPr>
-              <w:t>一/二/三等奖、</w:t>
+            <w:proofErr w:type="gramStart"/>
+            <w:r>
+              <w:rPr>
+                <w:rFonts w:ascii="黑体" w:eastAsia="黑体" w:hAnsi="黑体" w:hint="eastAsia"/>
+                <w:color w:val="808080" w:themeColor="background1" w:themeShade="80"/>
+              </w:rPr>
+              <w:t>一</w:t>
+            </w:r>
+            <w:proofErr w:type="gramEnd"/>
+            <w:r>
+              <w:rPr>
+                <w:rFonts w:ascii="黑体" w:eastAsia="黑体" w:hAnsi="黑体" w:hint="eastAsia"/>
+                <w:color w:val="808080" w:themeColor="background1" w:themeShade="80"/>
+              </w:rPr>
+              <w:t>/二/三等奖、</w:t>
             </w:r>
             <w:r>
               <w:rPr>
@@ -959,7 +1015,23 @@
                 <w:rFonts w:ascii="黑体" w:eastAsia="黑体" w:hAnsi="黑体" w:hint="eastAsia"/>
                 <w:color w:val="808080" w:themeColor="background1" w:themeShade="80"/>
               </w:rPr>
-              <w:t>；产品月活用户XXX人等；发表论文等</w:t>
+              <w:t>；</w:t>
+            </w:r>
+            <w:proofErr w:type="gramStart"/>
+            <w:r>
+              <w:rPr>
+                <w:rFonts w:ascii="黑体" w:eastAsia="黑体" w:hAnsi="黑体" w:hint="eastAsia"/>
+                <w:color w:val="808080" w:themeColor="background1" w:themeShade="80"/>
+              </w:rPr>
+              <w:t>产品月活用户</w:t>
+            </w:r>
+            <w:proofErr w:type="gramEnd"/>
+            <w:r>
+              <w:rPr>
+                <w:rFonts w:ascii="黑体" w:eastAsia="黑体" w:hAnsi="黑体" w:hint="eastAsia"/>
+                <w:color w:val="808080" w:themeColor="background1" w:themeShade="80"/>
+              </w:rPr>
+              <w:t>XXX人等；发表论文等</w:t>
             </w:r>
           </w:p>
         </w:tc>
@@ -1495,8 +1567,21 @@
               <w:rPr>
                 <w:rFonts w:ascii="黑体" w:eastAsia="黑体" w:hAnsi="黑体" w:hint="eastAsia"/>
               </w:rPr>
-              <w:lastRenderedPageBreak/>
-              <w:t>组长夸我很通透。高中的时候有参加过强基计划的培训，自认有一定的学习能力。认为兴趣就是最好的老师</w:t>
+              <w:t>组长夸我很通透。高中的时候有参加过强</w:t>
+            </w:r>
+            <w:proofErr w:type="gramStart"/>
+            <w:r>
+              <w:rPr>
+                <w:rFonts w:ascii="黑体" w:eastAsia="黑体" w:hAnsi="黑体" w:hint="eastAsia"/>
+              </w:rPr>
+              <w:t>基计划</w:t>
+            </w:r>
+            <w:proofErr w:type="gramEnd"/>
+            <w:r>
+              <w:rPr>
+                <w:rFonts w:ascii="黑体" w:eastAsia="黑体" w:hAnsi="黑体" w:hint="eastAsia"/>
+              </w:rPr>
+              <w:t>的培训，自认有一定的学习能力。认为兴趣就是最好的老师</w:t>
             </w:r>
           </w:p>
         </w:tc>

</xml_diff>